<commit_message>
Add ER diagram and update project documentation
</commit_message>
<xml_diff>
--- a/project/Paw_Care_Pet_Shop_and_Veterinary_Service_Management_System/Project_Report/G_08_Project_Proposal_Paw_Care _Pet_Shop_and_Veterinary_Service_Management_System (1).docx
+++ b/project/Paw_Care_Pet_Shop_and_Veterinary_Service_Management_System/Project_Report/G_08_Project_Proposal_Paw_Care _Pet_Shop_and_Veterinary_Service_Management_System (1).docx
@@ -654,21 +654,7 @@
               <w:rPr>
                 <w:rFonts w:ascii="Arial" w:hAnsi="Arial" w:cs="Arial"/>
               </w:rPr>
-              <w:t xml:space="preserve">Md. </w:t>
-            </w:r>
-            <w:proofErr w:type="spellStart"/>
-            <w:r>
-              <w:rPr>
-                <w:rFonts w:ascii="Arial" w:hAnsi="Arial" w:cs="Arial"/>
-              </w:rPr>
-              <w:t>Ashikur</w:t>
-            </w:r>
-            <w:proofErr w:type="spellEnd"/>
-            <w:r>
-              <w:rPr>
-                <w:rFonts w:ascii="Arial" w:hAnsi="Arial" w:cs="Arial"/>
-              </w:rPr>
-              <w:t xml:space="preserve"> Rahman Mirza</w:t>
+              <w:t>Md. Ashikur Rahman Mirza</w:t>
             </w:r>
           </w:p>
         </w:tc>
@@ -833,21 +819,7 @@
               <w:rPr>
                 <w:rFonts w:ascii="Arial" w:hAnsi="Arial" w:cs="Arial"/>
               </w:rPr>
-              <w:t xml:space="preserve">Md. </w:t>
-            </w:r>
-            <w:proofErr w:type="spellStart"/>
-            <w:r>
-              <w:rPr>
-                <w:rFonts w:ascii="Arial" w:hAnsi="Arial" w:cs="Arial"/>
-              </w:rPr>
-              <w:t>Mostafizur</w:t>
-            </w:r>
-            <w:proofErr w:type="spellEnd"/>
-            <w:r>
-              <w:rPr>
-                <w:rFonts w:ascii="Arial" w:hAnsi="Arial" w:cs="Arial"/>
-              </w:rPr>
-              <w:t xml:space="preserve"> Rahman</w:t>
+              <w:t>Md. Mostafizur Rahman</w:t>
             </w:r>
           </w:p>
         </w:tc>
@@ -1187,19 +1159,11 @@
                 <w:szCs w:val="22"/>
               </w:rPr>
             </w:pPr>
-            <w:proofErr w:type="spellStart"/>
             <w:r>
               <w:rPr>
                 <w:rFonts w:ascii="Arial" w:hAnsi="Arial" w:cs="Arial"/>
               </w:rPr>
-              <w:t>Shajia</w:t>
-            </w:r>
-            <w:proofErr w:type="spellEnd"/>
-            <w:r>
-              <w:rPr>
-                <w:rFonts w:ascii="Arial" w:hAnsi="Arial" w:cs="Arial"/>
-              </w:rPr>
-              <w:t xml:space="preserve"> Afrin</w:t>
+              <w:t>Shajia Afrin</w:t>
             </w:r>
           </w:p>
         </w:tc>
@@ -1438,14 +1402,7 @@
           <w:sz w:val="22"/>
           <w:szCs w:val="22"/>
         </w:rPr>
-        <w:t xml:space="preserve"> is a </w:t>
-      </w:r>
-      <w:r>
-        <w:rPr>
-          <w:sz w:val="22"/>
-          <w:szCs w:val="22"/>
-        </w:rPr>
-        <w:t>web</w:t>
+        <w:t xml:space="preserve"> is a web</w:t>
       </w:r>
       <w:r>
         <w:rPr>
@@ -1459,7 +1416,252 @@
           <w:sz w:val="22"/>
           <w:szCs w:val="22"/>
         </w:rPr>
-        <w:t xml:space="preserve"> pet shop and veterinary service management system designed to simplify pet-related services through a single online platform. The system allows customers to browse pets and pet products, place orders, book veterinary appointments, and track deliveries. Administrators can efficiently manage inventory, users, orders, and business operations, while veterinary doctors can organize appointments and maintain pet medical records. The system aims to provide a secure, user-friendly, and efficient digital solution for modern pet care businesses.</w:t>
+        <w:t xml:space="preserve"> pet shop and veterinary service management system</w:t>
+      </w:r>
+      <w:r>
+        <w:rPr>
+          <w:sz w:val="22"/>
+          <w:szCs w:val="22"/>
+        </w:rPr>
+        <w:t>. Which is</w:t>
+      </w:r>
+      <w:r>
+        <w:rPr>
+          <w:sz w:val="22"/>
+          <w:szCs w:val="22"/>
+        </w:rPr>
+        <w:t xml:space="preserve"> designed </w:t>
+      </w:r>
+      <w:r>
+        <w:rPr>
+          <w:sz w:val="22"/>
+          <w:szCs w:val="22"/>
+        </w:rPr>
+        <w:t>for</w:t>
+      </w:r>
+      <w:r>
+        <w:rPr>
+          <w:sz w:val="22"/>
+          <w:szCs w:val="22"/>
+        </w:rPr>
+        <w:t xml:space="preserve"> simplify </w:t>
+      </w:r>
+      <w:r>
+        <w:rPr>
+          <w:sz w:val="22"/>
+          <w:szCs w:val="22"/>
+        </w:rPr>
+        <w:t xml:space="preserve">the </w:t>
+      </w:r>
+      <w:r>
+        <w:rPr>
+          <w:sz w:val="22"/>
+          <w:szCs w:val="22"/>
+        </w:rPr>
+        <w:t>pet</w:t>
+      </w:r>
+      <w:r>
+        <w:rPr>
+          <w:sz w:val="22"/>
+          <w:szCs w:val="22"/>
+        </w:rPr>
+        <w:t xml:space="preserve"> </w:t>
+      </w:r>
+      <w:r>
+        <w:rPr>
+          <w:sz w:val="22"/>
+          <w:szCs w:val="22"/>
+        </w:rPr>
+        <w:t xml:space="preserve">related services </w:t>
+      </w:r>
+      <w:r>
+        <w:rPr>
+          <w:sz w:val="22"/>
+          <w:szCs w:val="22"/>
+        </w:rPr>
+        <w:t>by</w:t>
+      </w:r>
+      <w:r>
+        <w:rPr>
+          <w:sz w:val="22"/>
+          <w:szCs w:val="22"/>
+        </w:rPr>
+        <w:t xml:space="preserve"> a single online platform. The system allows customers</w:t>
+      </w:r>
+      <w:r>
+        <w:rPr>
+          <w:sz w:val="22"/>
+          <w:szCs w:val="22"/>
+        </w:rPr>
+        <w:t xml:space="preserve"> various services like</w:t>
+      </w:r>
+      <w:r>
+        <w:rPr>
+          <w:sz w:val="22"/>
+          <w:szCs w:val="22"/>
+        </w:rPr>
+        <w:t xml:space="preserve"> browse pets and pet products, place orders, book veterinary appointments, and</w:t>
+      </w:r>
+      <w:r>
+        <w:rPr>
+          <w:sz w:val="22"/>
+          <w:szCs w:val="22"/>
+        </w:rPr>
+        <w:t xml:space="preserve"> also</w:t>
+      </w:r>
+      <w:r>
+        <w:rPr>
+          <w:sz w:val="22"/>
+          <w:szCs w:val="22"/>
+        </w:rPr>
+        <w:t xml:space="preserve"> track deliveries.</w:t>
+      </w:r>
+      <w:r>
+        <w:rPr>
+          <w:sz w:val="22"/>
+          <w:szCs w:val="22"/>
+        </w:rPr>
+        <w:t xml:space="preserve"> Here, The System</w:t>
+      </w:r>
+      <w:r>
+        <w:rPr>
+          <w:sz w:val="22"/>
+          <w:szCs w:val="22"/>
+        </w:rPr>
+        <w:t xml:space="preserve"> Administrators can</w:t>
+      </w:r>
+      <w:r>
+        <w:rPr>
+          <w:sz w:val="22"/>
+          <w:szCs w:val="22"/>
+        </w:rPr>
+        <w:t xml:space="preserve"> </w:t>
+      </w:r>
+      <w:r>
+        <w:rPr>
+          <w:sz w:val="22"/>
+          <w:szCs w:val="22"/>
+        </w:rPr>
+        <w:t>manage inventory, users, orders, and business operations</w:t>
+      </w:r>
+      <w:r>
+        <w:rPr>
+          <w:sz w:val="22"/>
+          <w:szCs w:val="22"/>
+        </w:rPr>
+        <w:t xml:space="preserve"> very </w:t>
+      </w:r>
+      <w:r>
+        <w:rPr>
+          <w:sz w:val="22"/>
+          <w:szCs w:val="22"/>
+        </w:rPr>
+        <w:t>efficiently</w:t>
+      </w:r>
+      <w:r>
+        <w:rPr>
+          <w:sz w:val="22"/>
+          <w:szCs w:val="22"/>
+        </w:rPr>
+        <w:t>.</w:t>
+      </w:r>
+      <w:r>
+        <w:rPr>
+          <w:sz w:val="22"/>
+          <w:szCs w:val="22"/>
+        </w:rPr>
+        <w:t xml:space="preserve"> </w:t>
+      </w:r>
+      <w:r>
+        <w:rPr>
+          <w:sz w:val="22"/>
+          <w:szCs w:val="22"/>
+        </w:rPr>
+        <w:t xml:space="preserve">On the other hand, the </w:t>
+      </w:r>
+      <w:r>
+        <w:rPr>
+          <w:sz w:val="22"/>
+          <w:szCs w:val="22"/>
+        </w:rPr>
+        <w:t>veterinary doctors can organize appointments</w:t>
+      </w:r>
+      <w:r>
+        <w:rPr>
+          <w:sz w:val="22"/>
+          <w:szCs w:val="22"/>
+        </w:rPr>
+        <w:t xml:space="preserve"> for pets medical treatments</w:t>
+      </w:r>
+      <w:r>
+        <w:rPr>
+          <w:sz w:val="22"/>
+          <w:szCs w:val="22"/>
+        </w:rPr>
+        <w:t xml:space="preserve"> and maintain pet medical records</w:t>
+      </w:r>
+      <w:r>
+        <w:rPr>
+          <w:sz w:val="22"/>
+          <w:szCs w:val="22"/>
+        </w:rPr>
+        <w:t xml:space="preserve"> for any further purpose.</w:t>
+      </w:r>
+      <w:r>
+        <w:rPr>
+          <w:sz w:val="22"/>
+          <w:szCs w:val="22"/>
+        </w:rPr>
+        <w:t xml:space="preserve"> The</w:t>
+      </w:r>
+      <w:r>
+        <w:rPr>
+          <w:sz w:val="22"/>
+          <w:szCs w:val="22"/>
+        </w:rPr>
+        <w:t xml:space="preserve"> main purpose of the</w:t>
+      </w:r>
+      <w:r>
+        <w:rPr>
+          <w:sz w:val="22"/>
+          <w:szCs w:val="22"/>
+        </w:rPr>
+        <w:t xml:space="preserve"> system </w:t>
+      </w:r>
+      <w:r>
+        <w:rPr>
+          <w:sz w:val="22"/>
+          <w:szCs w:val="22"/>
+        </w:rPr>
+        <w:t xml:space="preserve">is </w:t>
+      </w:r>
+      <w:r>
+        <w:rPr>
+          <w:sz w:val="22"/>
+          <w:szCs w:val="22"/>
+        </w:rPr>
+        <w:t>to</w:t>
+      </w:r>
+      <w:r>
+        <w:rPr>
+          <w:sz w:val="22"/>
+          <w:szCs w:val="22"/>
+        </w:rPr>
+        <w:t xml:space="preserve"> provide a secure, user</w:t>
+      </w:r>
+      <w:r>
+        <w:rPr>
+          <w:sz w:val="22"/>
+          <w:szCs w:val="22"/>
+        </w:rPr>
+        <w:t xml:space="preserve"> </w:t>
+      </w:r>
+      <w:r>
+        <w:rPr>
+          <w:sz w:val="22"/>
+          <w:szCs w:val="22"/>
+        </w:rPr>
+        <w:t>friendly, and efficient digital solution for modern pet care businesses.</w:t>
       </w:r>
     </w:p>
     <w:p>
@@ -1488,7 +1690,67 @@
         <w:jc w:val="both"/>
       </w:pPr>
       <w:r>
-        <w:t>The pet care industry is growing rapidly, and many pet owners now expect convenient online services for purchasing pets, buying pet products, and accessing veterinary care. However, many pet shops still rely on manual record keeping or disconnected systems, making it difficult to manage inventory, customer orders, appointments, and business operations efficiently.</w:t>
+        <w:t>Nowadays, t</w:t>
+      </w:r>
+      <w:r>
+        <w:t>he pet care industry is growing rapidly</w:t>
+      </w:r>
+      <w:r>
+        <w:t xml:space="preserve"> day by </w:t>
+      </w:r>
+      <w:r>
+        <w:t>day,</w:t>
+      </w:r>
+      <w:r>
+        <w:t xml:space="preserve"> and many pet owners now </w:t>
+      </w:r>
+      <w:r>
+        <w:t>like to have a convenient online service</w:t>
+      </w:r>
+      <w:r>
+        <w:t xml:space="preserve"> for purchasing pets, buying</w:t>
+      </w:r>
+      <w:r>
+        <w:t xml:space="preserve"> necessary </w:t>
+      </w:r>
+      <w:r>
+        <w:t>pet products, and accessing veterinary care</w:t>
+      </w:r>
+      <w:r>
+        <w:t xml:space="preserve"> for their lovable pets.</w:t>
+      </w:r>
+      <w:r>
+        <w:t xml:space="preserve"> </w:t>
+      </w:r>
+      <w:r>
+        <w:t>Now in the current situation</w:t>
+      </w:r>
+      <w:r>
+        <w:t xml:space="preserve">, many pet shops still rely on </w:t>
+      </w:r>
+      <w:r>
+        <w:t>keeping record manually</w:t>
+      </w:r>
+      <w:r>
+        <w:t xml:space="preserve"> </w:t>
+      </w:r>
+      <w:r>
+        <w:t>for their services</w:t>
+      </w:r>
+      <w:r>
+        <w:t>,</w:t>
+      </w:r>
+      <w:r>
+        <w:t xml:space="preserve"> which is making</w:t>
+      </w:r>
+      <w:r>
+        <w:t xml:space="preserve"> it difficult to manage inventory, customer orders, appointments, and</w:t>
+      </w:r>
+      <w:r>
+        <w:t xml:space="preserve"> others</w:t>
+      </w:r>
+      <w:r>
+        <w:t xml:space="preserve"> business operations efficiently.</w:t>
       </w:r>
     </w:p>
     <w:p>
@@ -1497,19 +1759,46 @@
         <w:jc w:val="both"/>
       </w:pPr>
       <w:r>
-        <w:t>Paw</w:t>
-      </w:r>
-      <w:r>
-        <w:t xml:space="preserve"> </w:t>
-      </w:r>
-      <w:r>
-        <w:t xml:space="preserve">Care is a </w:t>
-      </w:r>
-      <w:r>
-        <w:t>web-based</w:t>
-      </w:r>
-      <w:r>
-        <w:t xml:space="preserve"> management system developed to provide an integrated digital platform for pet shops and veterinary services. The system enables customers to explore available pets and products, place online orders, schedule veterinary appointments, and manage their accounts from anywhere. At the same time, administrators can monitor business activities, manage inventory, oversee customer orders, and maintain overall system operations.</w:t>
+        <w:t xml:space="preserve">Now, </w:t>
+      </w:r>
+      <w:r>
+        <w:t xml:space="preserve">Paw Care is a web-based management system developed </w:t>
+      </w:r>
+      <w:r>
+        <w:t>for</w:t>
+      </w:r>
+      <w:r>
+        <w:t xml:space="preserve"> provid</w:t>
+      </w:r>
+      <w:r>
+        <w:t>ing</w:t>
+      </w:r>
+      <w:r>
+        <w:t xml:space="preserve"> an integrated digital platform for pet shops and veterinary services. The system </w:t>
+      </w:r>
+      <w:r>
+        <w:t>offers</w:t>
+      </w:r>
+      <w:r>
+        <w:t xml:space="preserve"> customers to explore available pets and </w:t>
+      </w:r>
+      <w:r>
+        <w:t>products. There are also some key features like</w:t>
+      </w:r>
+      <w:r>
+        <w:t xml:space="preserve"> place online orders, schedule veterinary appointments, and manage their accounts from anywhere.</w:t>
+      </w:r>
+      <w:r>
+        <w:t xml:space="preserve"> On the other hand,</w:t>
+      </w:r>
+      <w:r>
+        <w:t xml:space="preserve"> administrators can monitor business activities, manage inventory, and maintain overall system operations</w:t>
+      </w:r>
+      <w:r>
+        <w:t xml:space="preserve"> very easily</w:t>
+      </w:r>
+      <w:r>
+        <w:t>.</w:t>
       </w:r>
     </w:p>
     <w:p>
@@ -1518,13 +1807,50 @@
         <w:jc w:val="both"/>
       </w:pPr>
       <w:r>
-        <w:t>By combining pet shop management and veterinary services into a single web application, Paw</w:t>
+        <w:t>Here our main key motive is to</w:t>
+      </w:r>
+      <w:r>
+        <w:t xml:space="preserve"> combining pet shop management and veterinary services into a single web application</w:t>
+      </w:r>
+      <w:r>
+        <w:t xml:space="preserve"> and provide a use friendly service to the users. </w:t>
+      </w:r>
+      <w:r>
+        <w:t>Paw Care improves</w:t>
+      </w:r>
+      <w:r>
+        <w:t xml:space="preserve"> the</w:t>
+      </w:r>
+      <w:r>
+        <w:t xml:space="preserve"> service quality</w:t>
+      </w:r>
+      <w:r>
+        <w:t xml:space="preserve"> and</w:t>
+      </w:r>
+      <w:r>
+        <w:t xml:space="preserve"> reduces </w:t>
+      </w:r>
+      <w:r>
+        <w:lastRenderedPageBreak/>
+        <w:t>manual work</w:t>
+      </w:r>
+      <w:r>
+        <w:t xml:space="preserve"> also</w:t>
+      </w:r>
+      <w:r>
+        <w:t xml:space="preserve"> enhances data organization</w:t>
       </w:r>
       <w:r>
         <w:t xml:space="preserve"> </w:t>
       </w:r>
       <w:r>
-        <w:t>Care improves service quality, reduces manual work, enhances data organization, and provides a better experience for both business owners and customers.</w:t>
+        <w:t>and provides a better experience for both business owners and customers</w:t>
+      </w:r>
+      <w:r>
+        <w:t xml:space="preserve"> at a same time</w:t>
+      </w:r>
+      <w:r>
+        <w:t>.</w:t>
       </w:r>
     </w:p>
     <w:p>
@@ -1535,68 +1861,175 @@
           <w:szCs w:val="22"/>
         </w:rPr>
       </w:pPr>
+      <w:r>
+        <w:rPr>
+          <w:b/>
+          <w:bCs/>
+          <w:sz w:val="22"/>
+          <w:szCs w:val="22"/>
+        </w:rPr>
+        <w:t>Background Study</w:t>
+      </w:r>
     </w:p>
     <w:p>
       <w:pPr>
+        <w:pStyle w:val="pdq2pgselectionanchorcontainer"/>
+        <w:jc w:val="both"/>
+      </w:pPr>
+      <w:r>
+        <w:t>In recent years, web-based business management systems have become</w:t>
+      </w:r>
+      <w:r>
+        <w:t xml:space="preserve"> more</w:t>
+      </w:r>
+      <w:r>
+        <w:t xml:space="preserve"> popular</w:t>
+      </w:r>
+      <w:r>
+        <w:t>,</w:t>
+      </w:r>
+      <w:r>
+        <w:t xml:space="preserve"> because they provide </w:t>
+      </w:r>
+      <w:r>
+        <w:t xml:space="preserve">a </w:t>
+      </w:r>
+      <w:r>
+        <w:t xml:space="preserve">faster </w:t>
+      </w:r>
+      <w:r>
+        <w:t xml:space="preserve">way to </w:t>
+      </w:r>
+      <w:r>
+        <w:t>access information</w:t>
+      </w:r>
+      <w:r>
+        <w:t xml:space="preserve"> and</w:t>
+      </w:r>
+      <w:r>
+        <w:t xml:space="preserve"> better data management</w:t>
+      </w:r>
+      <w:r>
+        <w:t xml:space="preserve"> also</w:t>
+      </w:r>
+      <w:r>
+        <w:t xml:space="preserve"> improved customer experience. The pet care industry is also adopting</w:t>
+      </w:r>
+      <w:r>
+        <w:t xml:space="preserve"> these digital solutions</w:t>
+      </w:r>
+      <w:r>
+        <w:t xml:space="preserve"> to simplify business operations and </w:t>
+      </w:r>
+      <w:r>
+        <w:t>focusing on to provide more</w:t>
+      </w:r>
+      <w:r>
+        <w:t xml:space="preserve"> customer satisfaction.</w:t>
+      </w:r>
+    </w:p>
+    <w:p>
+      <w:pPr>
+        <w:pStyle w:val="NormalWeb"/>
+        <w:jc w:val="both"/>
+      </w:pPr>
+      <w:r>
+        <w:t>Traditional pet shops</w:t>
+      </w:r>
+      <w:r>
+        <w:t xml:space="preserve"> are</w:t>
+      </w:r>
+      <w:r>
+        <w:t xml:space="preserve"> maintain</w:t>
+      </w:r>
+      <w:r>
+        <w:t xml:space="preserve">ing </w:t>
+      </w:r>
+      <w:r>
+        <w:t>customer records, inventory, veterinary appointments, and sales manually or throug</w:t>
+      </w:r>
+      <w:r>
+        <w:t>h various</w:t>
+      </w:r>
+      <w:r>
+        <w:t xml:space="preserve"> desktop applications. These approaches may </w:t>
+      </w:r>
+      <w:r>
+        <w:t xml:space="preserve">be </w:t>
+      </w:r>
+      <w:r>
+        <w:t>lead</w:t>
+      </w:r>
+      <w:r>
+        <w:t xml:space="preserve"> them a serious trouble like </w:t>
+      </w:r>
+      <w:r>
+        <w:t xml:space="preserve">  data redundancy, inefficient workflows, and limited accessibility.</w:t>
+      </w:r>
+    </w:p>
+    <w:p>
+      <w:pPr>
+        <w:pStyle w:val="NormalWeb"/>
+        <w:jc w:val="both"/>
+      </w:pPr>
+      <w:r>
+        <w:t xml:space="preserve">Here, </w:t>
+      </w:r>
+      <w:r>
+        <w:t xml:space="preserve">Paw Care is proposed as a web-based </w:t>
+      </w:r>
+      <w:r>
+        <w:t>solution. Which is</w:t>
+      </w:r>
+      <w:r>
+        <w:t xml:space="preserve"> integrates pet shop operations, veterinary services, and delivery management into a single platform. By u</w:t>
+      </w:r>
+      <w:r>
+        <w:t>sing</w:t>
+      </w:r>
+      <w:r>
+        <w:t xml:space="preserve"> modern web technologies such as HTML, CSS, JavaScript, PHP, and MySQL, the system offers secure data management, real-time accessibility, and role-based functionalities for different types of users.</w:t>
+      </w:r>
+    </w:p>
+    <w:p>
+      <w:pPr>
         <w:spacing w:before="220" w:after="100"/>
-        <w:rPr>
-          <w:sz w:val="22"/>
-          <w:szCs w:val="22"/>
-        </w:rPr>
-      </w:pPr>
-      <w:r>
         <w:rPr>
           <w:b/>
           <w:bCs/>
           <w:sz w:val="22"/>
           <w:szCs w:val="22"/>
         </w:rPr>
-        <w:lastRenderedPageBreak/>
-        <w:t>Background Study</w:t>
+      </w:pPr>
+      <w:r>
+        <w:rPr>
+          <w:b/>
+          <w:bCs/>
+          <w:sz w:val="22"/>
+          <w:szCs w:val="22"/>
+        </w:rPr>
+        <w:t>ER Diagram</w:t>
       </w:r>
     </w:p>
     <w:p>
       <w:pPr>
-        <w:pStyle w:val="pdq2pgselectionanchorcontainer"/>
-        <w:jc w:val="both"/>
-      </w:pPr>
-      <w:r>
-        <w:t>In recent years, web-based business management systems have become increasingly popular because they provide faster access to information, better data management, and improved customer experience. The pet care industry is also adopting digital solutions to simplify business operations and enhance customer satisfaction.</w:t>
-      </w:r>
-    </w:p>
-    <w:p>
-      <w:pPr>
-        <w:pStyle w:val="NormalWeb"/>
-        <w:jc w:val="both"/>
-      </w:pPr>
-      <w:r>
-        <w:t>Traditional pet shops often maintain customer records, inventory, veterinary appointments, and sales manually or through standalone desktop applications. These approaches may lead to data redundancy, inefficient workflows, and limited accessibility.</w:t>
-      </w:r>
-    </w:p>
-    <w:p>
-      <w:pPr>
-        <w:pStyle w:val="NormalWeb"/>
-        <w:jc w:val="both"/>
+        <w:spacing w:before="220" w:after="100"/>
+        <w:rPr>
+          <w:sz w:val="22"/>
+          <w:szCs w:val="22"/>
+        </w:rPr>
       </w:pPr>
       <w:r>
         <w:rPr>
           <w:noProof/>
-          <w:lang w:eastAsia="zh-CN"/>
-          <w14:ligatures w14:val="standardContextual"/>
+          <w:sz w:val="22"/>
+          <w:szCs w:val="22"/>
         </w:rPr>
         <w:drawing>
-          <wp:anchor distT="0" distB="0" distL="114300" distR="114300" simplePos="0" relativeHeight="251659264" behindDoc="0" locked="0" layoutInCell="1" allowOverlap="1" wp14:anchorId="484C09E4" wp14:editId="78D88327">
-            <wp:simplePos x="0" y="0"/>
-            <wp:positionH relativeFrom="column">
-              <wp:posOffset>453390</wp:posOffset>
-            </wp:positionH>
-            <wp:positionV relativeFrom="paragraph">
-              <wp:posOffset>676275</wp:posOffset>
-            </wp:positionV>
-            <wp:extent cx="5402580" cy="6657340"/>
-            <wp:effectExtent l="1270" t="0" r="8890" b="8890"/>
-            <wp:wrapTopAndBottom/>
-            <wp:docPr id="3" name="Picture 3"/>
+          <wp:inline distT="0" distB="0" distL="0" distR="0" wp14:anchorId="0228FAEE" wp14:editId="695B7137">
+            <wp:extent cx="6565900" cy="4603750"/>
+            <wp:effectExtent l="0" t="0" r="6350" b="6350"/>
+            <wp:docPr id="8" name="Picture 8"/>
             <wp:cNvGraphicFramePr>
               <a:graphicFrameLocks xmlns:a="http://schemas.openxmlformats.org/drawingml/2006/main" noChangeAspect="1"/>
             </wp:cNvGraphicFramePr>
@@ -1604,10 +2037,12 @@
               <a:graphicData uri="http://schemas.openxmlformats.org/drawingml/2006/picture">
                 <pic:pic xmlns:pic="http://schemas.openxmlformats.org/drawingml/2006/picture">
                   <pic:nvPicPr>
-                    <pic:cNvPr id="1" name="Picture 1"/>
-                    <pic:cNvPicPr/>
+                    <pic:cNvPr id="0" name="Picture 1"/>
+                    <pic:cNvPicPr>
+                      <a:picLocks noChangeAspect="1" noChangeArrowheads="1"/>
+                    </pic:cNvPicPr>
                   </pic:nvPicPr>
-                  <pic:blipFill rotWithShape="1">
+                  <pic:blipFill>
                     <a:blip r:embed="rId9">
                       <a:extLst>
                         <a:ext uri="{28A0092B-C50C-407E-A947-70E740481C1C}">
@@ -1615,76 +2050,30 @@
                         </a:ext>
                       </a:extLst>
                     </a:blip>
-                    <a:srcRect l="3547" t="7363"/>
-                    <a:stretch/>
+                    <a:srcRect/>
+                    <a:stretch>
+                      <a:fillRect/>
+                    </a:stretch>
                   </pic:blipFill>
                   <pic:spPr bwMode="auto">
-                    <a:xfrm rot="5400000">
+                    <a:xfrm>
                       <a:off x="0" y="0"/>
-                      <a:ext cx="5402580" cy="6657340"/>
+                      <a:ext cx="6565900" cy="4603750"/>
                     </a:xfrm>
                     <a:prstGeom prst="rect">
                       <a:avLst/>
                     </a:prstGeom>
+                    <a:noFill/>
                     <a:ln>
                       <a:noFill/>
                     </a:ln>
-                    <a:extLst>
-                      <a:ext uri="{53640926-AAD7-44D8-BBD7-CCE9431645EC}">
-                        <a14:shadowObscured xmlns:a14="http://schemas.microsoft.com/office/drawing/2010/main"/>
-                      </a:ext>
-                    </a:extLst>
                   </pic:spPr>
                 </pic:pic>
               </a:graphicData>
             </a:graphic>
-            <wp14:sizeRelH relativeFrom="margin">
-              <wp14:pctWidth>0</wp14:pctWidth>
-            </wp14:sizeRelH>
-            <wp14:sizeRelV relativeFrom="margin">
-              <wp14:pctHeight>0</wp14:pctHeight>
-            </wp14:sizeRelV>
-          </wp:anchor>
+          </wp:inline>
         </w:drawing>
       </w:r>
-      <w:r>
-        <w:t>Paw</w:t>
-      </w:r>
-      <w:r>
-        <w:t xml:space="preserve"> </w:t>
-      </w:r>
-      <w:r>
-        <w:t>Care is proposed as a web-based solution that integrates pet shop operations, veterinary services, and delivery management into a single platform. By utilizing modern web technologies such as HTML, CSS, JavaScript, PHP, and MySQL, the system offers secure data management, real-time accessibility, and role-based functionalities for different types of users.</w:t>
-      </w:r>
-    </w:p>
-    <w:p>
-      <w:pPr>
-        <w:spacing w:before="220" w:after="100"/>
-        <w:rPr>
-          <w:b/>
-          <w:bCs/>
-          <w:sz w:val="22"/>
-          <w:szCs w:val="22"/>
-        </w:rPr>
-      </w:pPr>
-      <w:r>
-        <w:rPr>
-          <w:b/>
-          <w:bCs/>
-          <w:sz w:val="22"/>
-          <w:szCs w:val="22"/>
-        </w:rPr>
-        <w:t>ER Diagram</w:t>
-      </w:r>
-    </w:p>
-    <w:p>
-      <w:pPr>
-        <w:spacing w:before="220" w:after="100"/>
-        <w:rPr>
-          <w:sz w:val="22"/>
-          <w:szCs w:val="22"/>
-        </w:rPr>
-      </w:pPr>
     </w:p>
     <w:p>
       <w:pPr>
@@ -2059,16 +2448,7 @@
                 <w:sz w:val="22"/>
                 <w:szCs w:val="22"/>
               </w:rPr>
-              <w:t xml:space="preserve">: </w:t>
-            </w:r>
-            <w:r>
-              <w:rPr>
-                <w:b/>
-                <w:bCs/>
-                <w:sz w:val="22"/>
-                <w:szCs w:val="22"/>
-              </w:rPr>
-              <w:t>Administrator</w:t>
+              <w:t>: Administrator</w:t>
             </w:r>
           </w:p>
           <w:p>
@@ -2128,16 +2508,7 @@
                 <w:sz w:val="22"/>
                 <w:szCs w:val="22"/>
               </w:rPr>
-              <w:t xml:space="preserve">: </w:t>
-            </w:r>
-            <w:r>
-              <w:rPr>
-                <w:b/>
-                <w:bCs/>
-                <w:sz w:val="22"/>
-                <w:szCs w:val="22"/>
-              </w:rPr>
-              <w:t>Customer</w:t>
+              <w:t>: Customer</w:t>
             </w:r>
           </w:p>
           <w:p>
@@ -2206,16 +2577,7 @@
                 <w:sz w:val="22"/>
                 <w:szCs w:val="22"/>
               </w:rPr>
-              <w:t xml:space="preserve">: </w:t>
-            </w:r>
-            <w:r>
-              <w:rPr>
-                <w:b/>
-                <w:bCs/>
-                <w:sz w:val="22"/>
-                <w:szCs w:val="22"/>
-              </w:rPr>
-              <w:t>Veterinary Doctor</w:t>
+              <w:t>: Veterinary Doctor</w:t>
             </w:r>
           </w:p>
           <w:p>
@@ -2263,25 +2625,7 @@
                 <w:sz w:val="22"/>
                 <w:szCs w:val="22"/>
               </w:rPr>
-              <w:t>User</w:t>
-            </w:r>
-            <w:r>
-              <w:rPr>
-                <w:b/>
-                <w:bCs/>
-                <w:sz w:val="22"/>
-                <w:szCs w:val="22"/>
-              </w:rPr>
-              <w:t>4</w:t>
-            </w:r>
-            <w:r>
-              <w:rPr>
-                <w:b/>
-                <w:bCs/>
-                <w:sz w:val="22"/>
-                <w:szCs w:val="22"/>
-              </w:rPr>
-              <w:t>: Delivery Agent</w:t>
+              <w:t>User4: Delivery Agent</w:t>
             </w:r>
           </w:p>
           <w:p>
@@ -2627,16 +2971,7 @@
                 <w:sz w:val="22"/>
                 <w:szCs w:val="22"/>
               </w:rPr>
-              <w:t xml:space="preserve">: </w:t>
-            </w:r>
-            <w:r>
-              <w:rPr>
-                <w:b/>
-                <w:bCs/>
-                <w:sz w:val="22"/>
-                <w:szCs w:val="22"/>
-              </w:rPr>
-              <w:t>Administrator</w:t>
+              <w:t>: Administrator</w:t>
             </w:r>
           </w:p>
           <w:p>
@@ -2655,16 +2990,7 @@
                 <w:sz w:val="22"/>
                 <w:szCs w:val="22"/>
               </w:rPr>
-              <w:t>Inventory Management</w:t>
-            </w:r>
-            <w:r>
-              <w:rPr>
-                <w:b/>
-                <w:bCs/>
-                <w:sz w:val="22"/>
-                <w:szCs w:val="22"/>
-              </w:rPr>
-              <w:t>:</w:t>
+              <w:t>Inventory Management:</w:t>
             </w:r>
             <w:r>
               <w:rPr>
@@ -2674,10 +3000,7 @@
               <w:t xml:space="preserve"> </w:t>
             </w:r>
             <w:r>
-              <w:t>Add, Update, Delete Pets &amp; Products</w:t>
-            </w:r>
-            <w:r>
-              <w:t>.</w:t>
+              <w:t>Add, Update, Delete Pets &amp; Products.</w:t>
             </w:r>
           </w:p>
           <w:p>
@@ -2700,25 +3023,10 @@
                 <w:sz w:val="22"/>
                 <w:szCs w:val="22"/>
               </w:rPr>
-              <w:t>Order &amp; Delivery Management</w:t>
-            </w:r>
-            <w:r>
-              <w:rPr>
-                <w:b/>
-                <w:bCs/>
-                <w:sz w:val="22"/>
-                <w:szCs w:val="22"/>
-              </w:rPr>
-              <w:t>:</w:t>
-            </w:r>
-            <w:r>
-              <w:t xml:space="preserve"> </w:t>
-            </w:r>
-            <w:r>
-              <w:t>View Orders, Assign Delivery Agent, Update Order Status</w:t>
-            </w:r>
-            <w:r>
-              <w:t>.</w:t>
+              <w:t>Order &amp; Delivery Management:</w:t>
+            </w:r>
+            <w:r>
+              <w:t xml:space="preserve"> View Orders, Assign Delivery Agent, Update Order Status.</w:t>
             </w:r>
           </w:p>
           <w:p>
@@ -2743,16 +3051,7 @@
                 <w:sz w:val="22"/>
                 <w:szCs w:val="22"/>
               </w:rPr>
-              <w:t>User &amp; Business Monitoring</w:t>
-            </w:r>
-            <w:r>
-              <w:rPr>
-                <w:b/>
-                <w:bCs/>
-                <w:sz w:val="22"/>
-                <w:szCs w:val="22"/>
-              </w:rPr>
-              <w:t>:</w:t>
+              <w:t>User &amp; Business Monitoring:</w:t>
             </w:r>
             <w:r>
               <w:rPr>
@@ -2807,16 +3106,7 @@
                 <w:sz w:val="22"/>
                 <w:szCs w:val="22"/>
               </w:rPr>
-              <w:t xml:space="preserve"> </w:t>
-            </w:r>
-            <w:r>
-              <w:rPr>
-                <w:b/>
-                <w:bCs/>
-                <w:sz w:val="22"/>
-                <w:szCs w:val="22"/>
-              </w:rPr>
-              <w:t>Customer</w:t>
+              <w:t xml:space="preserve"> Customer</w:t>
             </w:r>
           </w:p>
           <w:p>
@@ -2841,16 +3131,7 @@
                 <w:sz w:val="22"/>
                 <w:szCs w:val="22"/>
               </w:rPr>
-              <w:t>Browse &amp; Purchase Pets and Products</w:t>
-            </w:r>
-            <w:r>
-              <w:rPr>
-                <w:b/>
-                <w:bCs/>
-                <w:sz w:val="22"/>
-                <w:szCs w:val="22"/>
-              </w:rPr>
-              <w:t>:</w:t>
+              <w:t>Browse &amp; Purchase Pets and Products:</w:t>
             </w:r>
             <w:r>
               <w:rPr>
@@ -2862,10 +3143,7 @@
               <w:t xml:space="preserve"> </w:t>
             </w:r>
             <w:r>
-              <w:t>Search, Filter, View Details, Add to Cart</w:t>
-            </w:r>
-            <w:r>
-              <w:t>.</w:t>
+              <w:t>Search, Filter, View Details, Add to Cart.</w:t>
             </w:r>
           </w:p>
           <w:p>
@@ -2890,16 +3168,7 @@
                 <w:sz w:val="22"/>
                 <w:szCs w:val="22"/>
               </w:rPr>
-              <w:t>Veterinary Appointment Booking</w:t>
-            </w:r>
-            <w:r>
-              <w:rPr>
-                <w:b/>
-                <w:bCs/>
-                <w:sz w:val="22"/>
-                <w:szCs w:val="22"/>
-              </w:rPr>
-              <w:t>:</w:t>
+              <w:t>Veterinary Appointment Booking:</w:t>
             </w:r>
             <w:r>
               <w:rPr>
@@ -2911,10 +3180,7 @@
               <w:t xml:space="preserve"> </w:t>
             </w:r>
             <w:r>
-              <w:t>Book Doctor Appointment and View Appointment Status</w:t>
-            </w:r>
-            <w:r>
-              <w:t>.</w:t>
+              <w:t>Book Doctor Appointment and View Appointment Status.</w:t>
             </w:r>
           </w:p>
           <w:p>
@@ -2939,22 +3205,10 @@
                 <w:sz w:val="22"/>
                 <w:szCs w:val="22"/>
               </w:rPr>
-              <w:t>Order Tracking &amp; Reviews</w:t>
-            </w:r>
-            <w:r>
-              <w:rPr>
-                <w:b/>
-                <w:bCs/>
-                <w:sz w:val="22"/>
-                <w:szCs w:val="22"/>
-              </w:rPr>
-              <w:t>:</w:t>
-            </w:r>
-            <w:r>
-              <w:t xml:space="preserve"> </w:t>
-            </w:r>
-            <w:r>
-              <w:t>Track Orders, View Purchase History, Submit Reviews</w:t>
+              <w:t>Order Tracking &amp; Reviews:</w:t>
+            </w:r>
+            <w:r>
+              <w:t xml:space="preserve"> Track Orders, View Purchase History, Submit Reviews</w:t>
             </w:r>
           </w:p>
           <w:p>
@@ -2988,16 +3242,7 @@
                 <w:sz w:val="22"/>
                 <w:szCs w:val="22"/>
               </w:rPr>
-              <w:t xml:space="preserve">: </w:t>
-            </w:r>
-            <w:r>
-              <w:rPr>
-                <w:b/>
-                <w:bCs/>
-                <w:sz w:val="22"/>
-                <w:szCs w:val="22"/>
-              </w:rPr>
-              <w:t>Veterinary Doctor</w:t>
+              <w:t>: Veterinary Doctor</w:t>
             </w:r>
           </w:p>
           <w:p>
@@ -3022,22 +3267,10 @@
                 <w:sz w:val="22"/>
                 <w:szCs w:val="22"/>
               </w:rPr>
-              <w:t>Appointment Management</w:t>
-            </w:r>
-            <w:r>
-              <w:rPr>
-                <w:b/>
-                <w:bCs/>
-                <w:sz w:val="22"/>
-                <w:szCs w:val="22"/>
-              </w:rPr>
-              <w:t>:</w:t>
-            </w:r>
-            <w:r>
-              <w:t xml:space="preserve"> </w:t>
-            </w:r>
-            <w:r>
-              <w:t>View and Manage Daily Appointments</w:t>
+              <w:t>Appointment Management:</w:t>
+            </w:r>
+            <w:r>
+              <w:t xml:space="preserve"> View and Manage Daily Appointments</w:t>
             </w:r>
           </w:p>
           <w:p>
@@ -3062,16 +3295,7 @@
                 <w:sz w:val="22"/>
                 <w:szCs w:val="22"/>
               </w:rPr>
-              <w:t>Pet Medical Records</w:t>
-            </w:r>
-            <w:r>
-              <w:rPr>
-                <w:b/>
-                <w:bCs/>
-                <w:sz w:val="22"/>
-                <w:szCs w:val="22"/>
-              </w:rPr>
-              <w:t>:</w:t>
+              <w:t>Pet Medical Records:</w:t>
             </w:r>
             <w:r>
               <w:rPr>
@@ -3120,10 +3344,7 @@
               <w:t>:</w:t>
             </w:r>
             <w:r>
-              <w:t xml:space="preserve"> </w:t>
-            </w:r>
-            <w:r>
-              <w:t>View Previous Medical History and Consultation Records</w:t>
+              <w:t xml:space="preserve"> View Previous Medical History and Consultation Records</w:t>
             </w:r>
           </w:p>
           <w:p>
@@ -3148,25 +3369,7 @@
                 <w:sz w:val="22"/>
                 <w:szCs w:val="22"/>
               </w:rPr>
-              <w:t>Features of User</w:t>
-            </w:r>
-            <w:r>
-              <w:rPr>
-                <w:b/>
-                <w:bCs/>
-                <w:sz w:val="22"/>
-                <w:szCs w:val="22"/>
-              </w:rPr>
-              <w:t xml:space="preserve">4: </w:t>
-            </w:r>
-            <w:r>
-              <w:rPr>
-                <w:b/>
-                <w:bCs/>
-                <w:sz w:val="22"/>
-                <w:szCs w:val="22"/>
-              </w:rPr>
-              <w:t>Delivery Agent</w:t>
+              <w:t>Features of User4: Delivery Agent</w:t>
             </w:r>
           </w:p>
           <w:p>
@@ -3194,10 +3397,7 @@
               <w:t>Assigned Order List:</w:t>
             </w:r>
             <w:r>
-              <w:t xml:space="preserve"> </w:t>
-            </w:r>
-            <w:r>
-              <w:t>View Assigned Deliveries</w:t>
+              <w:t xml:space="preserve"> View Assigned Deliveries</w:t>
             </w:r>
           </w:p>
           <w:p>
@@ -3232,13 +3432,7 @@
               <w:t>:</w:t>
             </w:r>
             <w:r>
-              <w:t xml:space="preserve"> </w:t>
-            </w:r>
-            <w:r>
-              <w:t>Update Order Status such as Out for Delivery and Delivered</w:t>
-            </w:r>
-            <w:r>
-              <w:t>.</w:t>
+              <w:t xml:space="preserve"> Update Order Status such as Out for Delivery and Delivered.</w:t>
             </w:r>
           </w:p>
           <w:p>

</xml_diff>